<commit_message>
Màj de la documentation
</commit_message>
<xml_diff>
--- a/docs/Documentation.docx
+++ b/docs/Documentation.docx
@@ -9,6 +9,55 @@
       </w:pPr>
       <w:r>
         <w:t>RP Windows Server</w:t>
+      </w:r>
+    </w:p>
+    <w:p/>
+    <w:p>
+      <w:r>
+        <w:rPr>
+          <w:noProof/>
+        </w:rPr>
+        <w:drawing>
+          <wp:inline distT="0" distB="0" distL="0" distR="0" wp14:anchorId="6E0F17D2" wp14:editId="0B46319B">
+            <wp:extent cx="5760720" cy="3886835"/>
+            <wp:effectExtent l="0" t="0" r="0" b="0"/>
+            <wp:docPr id="539460384" name="Image 3"/>
+            <wp:cNvGraphicFramePr>
+              <a:graphicFrameLocks xmlns:a="http://schemas.openxmlformats.org/drawingml/2006/main" noChangeAspect="1"/>
+            </wp:cNvGraphicFramePr>
+            <a:graphic xmlns:a="http://schemas.openxmlformats.org/drawingml/2006/main">
+              <a:graphicData uri="http://schemas.openxmlformats.org/drawingml/2006/picture">
+                <pic:pic xmlns:pic="http://schemas.openxmlformats.org/drawingml/2006/picture">
+                  <pic:nvPicPr>
+                    <pic:cNvPr id="539460384" name="Image 539460384"/>
+                    <pic:cNvPicPr/>
+                  </pic:nvPicPr>
+                  <pic:blipFill>
+                    <a:blip r:embed="rId4">
+                      <a:extLst>
+                        <a:ext uri="{28A0092B-C50C-407E-A947-70E740481C1C}">
+                          <a14:useLocalDpi xmlns:a14="http://schemas.microsoft.com/office/drawing/2010/main" val="0"/>
+                        </a:ext>
+                      </a:extLst>
+                    </a:blip>
+                    <a:stretch>
+                      <a:fillRect/>
+                    </a:stretch>
+                  </pic:blipFill>
+                  <pic:spPr>
+                    <a:xfrm>
+                      <a:off x="0" y="0"/>
+                      <a:ext cx="5760720" cy="3886835"/>
+                    </a:xfrm>
+                    <a:prstGeom prst="rect">
+                      <a:avLst/>
+                    </a:prstGeom>
+                  </pic:spPr>
+                </pic:pic>
+              </a:graphicData>
+            </a:graphic>
+          </wp:inline>
+        </w:drawing>
       </w:r>
     </w:p>
     <w:p/>
@@ -36,7 +85,7 @@
                     <pic:cNvPicPr/>
                   </pic:nvPicPr>
                   <pic:blipFill>
-                    <a:blip r:embed="rId4">
+                    <a:blip r:embed="rId5">
                       <a:extLst>
                         <a:ext uri="{28A0092B-C50C-407E-A947-70E740481C1C}">
                           <a14:useLocalDpi xmlns:a14="http://schemas.microsoft.com/office/drawing/2010/main" val="0"/>
@@ -85,6 +134,7 @@
     </w:p>
     <w:p>
       <w:r>
+        <w:lastRenderedPageBreak/>
         <w:t>Configuration de 3 VM : le contrôleur de domaine (SRV-DC1) et le serveur de fichier SRV-FS1 avec Windows Server 2022, et le client avec Windows 11 (CL-W11).</w:t>
       </w:r>
     </w:p>
@@ -102,6 +152,1128 @@
       </w:r>
     </w:p>
     <w:p/>
+    <w:p>
+      <w:pPr>
+        <w:pStyle w:val="Sous-titre"/>
+      </w:pPr>
+      <w:r>
+        <w:t>Configuration d’une stratégie de mot de passe affinée grâce à IT-</w:t>
+      </w:r>
+      <w:proofErr w:type="spellStart"/>
+      <w:r>
+        <w:t>Connect</w:t>
+      </w:r>
+      <w:proofErr w:type="spellEnd"/>
+    </w:p>
+    <w:p>
+      <w:r>
+        <w:t xml:space="preserve">Accès à Centre Administration Active Directory &gt; System &gt; </w:t>
+      </w:r>
+      <w:proofErr w:type="spellStart"/>
+      <w:r>
+        <w:t>Password</w:t>
+      </w:r>
+      <w:proofErr w:type="spellEnd"/>
+      <w:r>
+        <w:t xml:space="preserve"> Settings Container &gt; Tâches &gt; Nouveau &gt; Paramètres de mot de passe</w:t>
+      </w:r>
+    </w:p>
+    <w:p>
+      <w:r>
+        <w:rPr>
+          <w:noProof/>
+        </w:rPr>
+        <w:drawing>
+          <wp:inline distT="0" distB="0" distL="0" distR="0" wp14:anchorId="5AA2AB9A" wp14:editId="542B5E41">
+            <wp:extent cx="5760720" cy="3075940"/>
+            <wp:effectExtent l="0" t="0" r="0" b="0"/>
+            <wp:docPr id="1088624087" name="Image 1"/>
+            <wp:cNvGraphicFramePr>
+              <a:graphicFrameLocks xmlns:a="http://schemas.openxmlformats.org/drawingml/2006/main" noChangeAspect="1"/>
+            </wp:cNvGraphicFramePr>
+            <a:graphic xmlns:a="http://schemas.openxmlformats.org/drawingml/2006/main">
+              <a:graphicData uri="http://schemas.openxmlformats.org/drawingml/2006/picture">
+                <pic:pic xmlns:pic="http://schemas.openxmlformats.org/drawingml/2006/picture">
+                  <pic:nvPicPr>
+                    <pic:cNvPr id="1088624087" name="Image 1088624087"/>
+                    <pic:cNvPicPr/>
+                  </pic:nvPicPr>
+                  <pic:blipFill>
+                    <a:blip r:embed="rId6" cstate="print">
+                      <a:extLst>
+                        <a:ext uri="{28A0092B-C50C-407E-A947-70E740481C1C}">
+                          <a14:useLocalDpi xmlns:a14="http://schemas.microsoft.com/office/drawing/2010/main" val="0"/>
+                        </a:ext>
+                      </a:extLst>
+                    </a:blip>
+                    <a:stretch>
+                      <a:fillRect/>
+                    </a:stretch>
+                  </pic:blipFill>
+                  <pic:spPr>
+                    <a:xfrm>
+                      <a:off x="0" y="0"/>
+                      <a:ext cx="5760720" cy="3075940"/>
+                    </a:xfrm>
+                    <a:prstGeom prst="rect">
+                      <a:avLst/>
+                    </a:prstGeom>
+                  </pic:spPr>
+                </pic:pic>
+              </a:graphicData>
+            </a:graphic>
+          </wp:inline>
+        </w:drawing>
+      </w:r>
+    </w:p>
+    <w:p>
+      <w:r>
+        <w:t xml:space="preserve">Nous avons accès à plusieurs paramètres. J’ai nommé la règle </w:t>
+      </w:r>
+      <w:proofErr w:type="spellStart"/>
+      <w:r>
+        <w:t>PSO_Mediaschool</w:t>
+      </w:r>
+      <w:proofErr w:type="spellEnd"/>
+      <w:r>
+        <w:t xml:space="preserve">, PSO pour </w:t>
+      </w:r>
+      <w:proofErr w:type="spellStart"/>
+      <w:r>
+        <w:t>Password</w:t>
+      </w:r>
+      <w:proofErr w:type="spellEnd"/>
+      <w:r>
+        <w:t xml:space="preserve"> </w:t>
+      </w:r>
+      <w:proofErr w:type="spellStart"/>
+      <w:r>
+        <w:t>Strategy</w:t>
+      </w:r>
+      <w:proofErr w:type="spellEnd"/>
+      <w:r>
+        <w:t xml:space="preserve"> Object et </w:t>
+      </w:r>
+      <w:proofErr w:type="spellStart"/>
+      <w:r>
+        <w:t>Mediaschool</w:t>
+      </w:r>
+      <w:proofErr w:type="spellEnd"/>
+      <w:r>
+        <w:t xml:space="preserve"> </w:t>
+      </w:r>
+      <w:r>
+        <w:t>étant</w:t>
+      </w:r>
+      <w:r>
+        <w:t xml:space="preserve"> le nom de l’école. Pour la longueur</w:t>
+      </w:r>
+      <w:r>
+        <w:t xml:space="preserve"> du mot de passe</w:t>
+      </w:r>
+      <w:r>
+        <w:t>, j’ai appliqué 12 caractères minimums, avec un historique de 12 mots de passes mémorisés. J’ai également activé le renouvellement du mot de passe au maximum après 90 jours, c’est important surtout pour les comptes sensibles (</w:t>
+      </w:r>
+      <w:r>
+        <w:t>root). J’ai également appliqué une stratégie de verrouillage des compte</w:t>
+      </w:r>
+      <w:r>
+        <w:t>s</w:t>
+      </w:r>
+      <w:r>
+        <w:t xml:space="preserve"> </w:t>
+      </w:r>
+      <w:r>
+        <w:t>après</w:t>
+      </w:r>
+      <w:r>
+        <w:t xml:space="preserve"> </w:t>
+      </w:r>
+      <w:r>
+        <w:t>5</w:t>
+      </w:r>
+      <w:r>
+        <w:t xml:space="preserve"> tentatives maximum</w:t>
+      </w:r>
+      <w:r>
+        <w:t xml:space="preserve"> il y a un</w:t>
+      </w:r>
+      <w:r>
+        <w:t xml:space="preserve"> verrouillage de 30 mins, cela peut éviter des attaques par brute force notamment.</w:t>
+      </w:r>
+    </w:p>
+    <w:p/>
+    <w:p/>
+    <w:p/>
+    <w:p/>
+    <w:p>
+      <w:pPr>
+        <w:pStyle w:val="Sous-titre"/>
+      </w:pPr>
+      <w:r>
+        <w:lastRenderedPageBreak/>
+        <w:t>Créer des home folders</w:t>
+      </w:r>
+    </w:p>
+    <w:p>
+      <w:r>
+        <w:t>New-</w:t>
+      </w:r>
+      <w:proofErr w:type="spellStart"/>
+      <w:r>
+        <w:t>ADGroup</w:t>
+      </w:r>
+      <w:proofErr w:type="spellEnd"/>
+      <w:r>
+        <w:t xml:space="preserve"> -Name "GRP-FOLDER-REDIRECTION" -</w:t>
+      </w:r>
+      <w:proofErr w:type="spellStart"/>
+      <w:r>
+        <w:t>SamAccountName</w:t>
+      </w:r>
+      <w:proofErr w:type="spellEnd"/>
+      <w:r>
+        <w:t xml:space="preserve"> "GRP-FOLDER-REDIRECTION" `</w:t>
+      </w:r>
+    </w:p>
+    <w:p>
+      <w:r>
+        <w:t xml:space="preserve">            -</w:t>
+      </w:r>
+      <w:proofErr w:type="spellStart"/>
+      <w:r>
+        <w:t>GroupCategory</w:t>
+      </w:r>
+      <w:proofErr w:type="spellEnd"/>
+      <w:r>
+        <w:t xml:space="preserve"> Security -</w:t>
+      </w:r>
+      <w:proofErr w:type="spellStart"/>
+      <w:r>
+        <w:t>GroupScope</w:t>
+      </w:r>
+      <w:proofErr w:type="spellEnd"/>
+      <w:r>
+        <w:t xml:space="preserve"> </w:t>
+      </w:r>
+      <w:proofErr w:type="spellStart"/>
+      <w:r>
+        <w:t>DomainLocal</w:t>
+      </w:r>
+      <w:proofErr w:type="spellEnd"/>
+      <w:r>
+        <w:t xml:space="preserve"> `</w:t>
+      </w:r>
+    </w:p>
+    <w:p>
+      <w:r>
+        <w:t xml:space="preserve">            -Description "Utilisateurs ayant un profil redirigé"</w:t>
+      </w:r>
+    </w:p>
+    <w:p/>
+    <w:p>
+      <w:r>
+        <w:t>Add-</w:t>
+      </w:r>
+      <w:proofErr w:type="spellStart"/>
+      <w:r>
+        <w:t>ADGroupMember</w:t>
+      </w:r>
+      <w:proofErr w:type="spellEnd"/>
+      <w:r>
+        <w:t xml:space="preserve"> -Identity "GRP-FOLDER-REDIRECTION" -Members SISR_1, SISR_2, SLAM_1, SLAM_2, Admin_1, Admin_2, Enseignant_1, Enseignant_</w:t>
+      </w:r>
+      <w:r>
+        <w:t>2</w:t>
+      </w:r>
+    </w:p>
+    <w:p>
+      <w:r>
+        <w:t>https://www.it-connect.fr/redirection-de-profils-utilisateurs-avec-windows-server/</w:t>
+      </w:r>
+    </w:p>
+    <w:p/>
+    <w:p>
+      <w:pPr>
+        <w:pStyle w:val="Sous-titre"/>
+      </w:pPr>
+      <w:r>
+        <w:t>Modification des permissions en fonction du statut</w:t>
+      </w:r>
+    </w:p>
+    <w:p>
+      <w:pPr>
+        <w:rPr>
+          <w:noProof/>
+        </w:rPr>
+      </w:pPr>
+      <w:r>
+        <w:rPr>
+          <w:noProof/>
+        </w:rPr>
+        <w:drawing>
+          <wp:inline distT="0" distB="0" distL="0" distR="0" wp14:anchorId="7064A905" wp14:editId="1BE75424">
+            <wp:extent cx="5760720" cy="3081020"/>
+            <wp:effectExtent l="0" t="0" r="0" b="5080"/>
+            <wp:docPr id="1365184815" name="Image 2"/>
+            <wp:cNvGraphicFramePr>
+              <a:graphicFrameLocks xmlns:a="http://schemas.openxmlformats.org/drawingml/2006/main" noChangeAspect="1"/>
+            </wp:cNvGraphicFramePr>
+            <a:graphic xmlns:a="http://schemas.openxmlformats.org/drawingml/2006/main">
+              <a:graphicData uri="http://schemas.openxmlformats.org/drawingml/2006/picture">
+                <pic:pic xmlns:pic="http://schemas.openxmlformats.org/drawingml/2006/picture">
+                  <pic:nvPicPr>
+                    <pic:cNvPr id="1365184815" name="Image 1365184815"/>
+                    <pic:cNvPicPr/>
+                  </pic:nvPicPr>
+                  <pic:blipFill>
+                    <a:blip r:embed="rId7" cstate="print">
+                      <a:extLst>
+                        <a:ext uri="{28A0092B-C50C-407E-A947-70E740481C1C}">
+                          <a14:useLocalDpi xmlns:a14="http://schemas.microsoft.com/office/drawing/2010/main" val="0"/>
+                        </a:ext>
+                      </a:extLst>
+                    </a:blip>
+                    <a:stretch>
+                      <a:fillRect/>
+                    </a:stretch>
+                  </pic:blipFill>
+                  <pic:spPr>
+                    <a:xfrm>
+                      <a:off x="0" y="0"/>
+                      <a:ext cx="5760720" cy="3081020"/>
+                    </a:xfrm>
+                    <a:prstGeom prst="rect">
+                      <a:avLst/>
+                    </a:prstGeom>
+                  </pic:spPr>
+                </pic:pic>
+              </a:graphicData>
+            </a:graphic>
+          </wp:inline>
+        </w:drawing>
+      </w:r>
+    </w:p>
+    <w:p>
+      <w:r>
+        <w:t>Pour accéder au dossier Partage-new, j’ai modifié les droits en fonction du profil. Pour cela, clic droit sur le dossier &gt; Propriété &gt;</w:t>
+      </w:r>
+      <w:r>
+        <w:t xml:space="preserve"> Partage &gt; Partage avancé &gt; Autorisations</w:t>
+      </w:r>
+      <w:r>
+        <w:t xml:space="preserve">. Pour ajouter un utilisateur, il suffit de cliquer sur ajouter, puis nous pouvons modifier ses droits. Je me suis basé sur les fonctions pour établir les droits : les admins ont un contrôle total, les </w:t>
+      </w:r>
+      <w:r>
+        <w:t>enseignants</w:t>
+      </w:r>
+      <w:r>
+        <w:t xml:space="preserve"> peuvent modifier et lire, tandis que les étudiants</w:t>
+      </w:r>
+      <w:r>
+        <w:t xml:space="preserve"> (SLAM et SISR)</w:t>
+      </w:r>
+      <w:r>
+        <w:t xml:space="preserve"> peuvent seulement lire.</w:t>
+      </w:r>
+    </w:p>
+    <w:p/>
+    <w:p/>
+    <w:p/>
+    <w:p>
+      <w:hyperlink r:id="rId8" w:history="1">
+        <w:r>
+          <w:rPr>
+            <w:rStyle w:val="Lienhypertexte"/>
+          </w:rPr>
+          <w:t>https://www.it-connect.fr/chapitres/creer-des-utilisateurs-dans-lad-a-partir-dun-csv/</w:t>
+        </w:r>
+      </w:hyperlink>
+    </w:p>
+    <w:p>
+      <w:pPr>
+        <w:pStyle w:val="Sous-titre"/>
+      </w:pPr>
+      <w:r>
+        <w:t>Créer des utilisateurs en masse depuis un fichier CSV</w:t>
+      </w:r>
+    </w:p>
+    <w:p>
+      <w:r>
+        <w:t>J’ai ouvert le bloc note, en rentrant le nom d’utilisateur ainsi que le mot de passe, séparé d’une virgule uniquement. Pour chaque utilisateur, je vais à la ligne.</w:t>
+      </w:r>
+      <w:r>
+        <w:t xml:space="preserve"> Lors de l’enregistrement, je rentre le </w:t>
+      </w:r>
+      <w:proofErr w:type="spellStart"/>
+      <w:r>
+        <w:t>nomdufichier</w:t>
+      </w:r>
+      <w:proofErr w:type="spellEnd"/>
+      <w:r>
+        <w:t xml:space="preserve"> avec l’extension .csv.</w:t>
+      </w:r>
+    </w:p>
+    <w:p/>
+    <w:p/>
+    <w:p/>
+    <w:p/>
+    <w:p>
+      <w:r>
+        <w:t>https://www.it-connect.fr/chapitres/creer-des-utilisateurs-dans-lad-a-partir-dun-csv/</w:t>
+      </w:r>
+    </w:p>
+    <w:p/>
+    <w:p>
+      <w:proofErr w:type="spellStart"/>
+      <w:proofErr w:type="gramStart"/>
+      <w:r>
+        <w:t>Foreach</w:t>
+      </w:r>
+      <w:proofErr w:type="spellEnd"/>
+      <w:r>
+        <w:t>(</w:t>
+      </w:r>
+      <w:proofErr w:type="gramEnd"/>
+      <w:r>
+        <w:t>$Utilisateur in $</w:t>
+      </w:r>
+      <w:proofErr w:type="spellStart"/>
+      <w:proofErr w:type="gramStart"/>
+      <w:r>
+        <w:t>CSVData</w:t>
+      </w:r>
+      <w:proofErr w:type="spellEnd"/>
+      <w:r>
+        <w:t>){</w:t>
+      </w:r>
+      <w:proofErr w:type="gramEnd"/>
+    </w:p>
+    <w:p>
+      <w:r>
+        <w:t xml:space="preserve">    $</w:t>
+      </w:r>
+      <w:proofErr w:type="spellStart"/>
+      <w:r>
+        <w:t>Utilisateur</w:t>
+      </w:r>
+      <w:r>
+        <w:t>Fonction</w:t>
+      </w:r>
+      <w:proofErr w:type="spellEnd"/>
+      <w:r>
+        <w:t xml:space="preserve"> = $</w:t>
+      </w:r>
+      <w:proofErr w:type="spellStart"/>
+      <w:r>
+        <w:t>Utilisateur.</w:t>
+      </w:r>
+      <w:r>
+        <w:t>Fonction</w:t>
+      </w:r>
+      <w:proofErr w:type="spellEnd"/>
+    </w:p>
+    <w:p>
+      <w:r>
+        <w:t xml:space="preserve">    $</w:t>
+      </w:r>
+      <w:proofErr w:type="spellStart"/>
+      <w:r>
+        <w:t>Utilisateur</w:t>
+      </w:r>
+      <w:r>
+        <w:t>MotDePasse</w:t>
+      </w:r>
+      <w:proofErr w:type="spellEnd"/>
+      <w:r>
+        <w:t xml:space="preserve"> = $</w:t>
+      </w:r>
+      <w:proofErr w:type="spellStart"/>
+      <w:r>
+        <w:t>Utilisateur.</w:t>
+      </w:r>
+      <w:r>
+        <w:t>MotDePasse</w:t>
+      </w:r>
+      <w:proofErr w:type="spellEnd"/>
+    </w:p>
+    <w:p>
+      <w:r>
+        <w:t>}</w:t>
+      </w:r>
+    </w:p>
+    <w:p/>
+    <w:p>
+      <w:r>
+        <w:t># Vérifier la présence de l'utilisateur dans l'AD</w:t>
+      </w:r>
+    </w:p>
+    <w:p/>
+    <w:p>
+      <w:proofErr w:type="gramStart"/>
+      <w:r>
+        <w:t>if</w:t>
+      </w:r>
+      <w:proofErr w:type="gramEnd"/>
+      <w:r>
+        <w:t xml:space="preserve"> (</w:t>
+      </w:r>
+      <w:proofErr w:type="spellStart"/>
+      <w:r>
+        <w:t>Get-ADUser</w:t>
+      </w:r>
+      <w:proofErr w:type="spellEnd"/>
+      <w:r>
+        <w:t xml:space="preserve"> -Filter {</w:t>
+      </w:r>
+      <w:proofErr w:type="spellStart"/>
+      <w:r>
+        <w:t>SamAccountName</w:t>
+      </w:r>
+      <w:proofErr w:type="spellEnd"/>
+      <w:r>
+        <w:t xml:space="preserve"> -eq $</w:t>
+      </w:r>
+      <w:proofErr w:type="spellStart"/>
+      <w:r>
+        <w:t>Utilisateur</w:t>
+      </w:r>
+      <w:r>
+        <w:t>Fonction</w:t>
+      </w:r>
+      <w:proofErr w:type="spellEnd"/>
+      <w:r>
+        <w:t>})</w:t>
+      </w:r>
+    </w:p>
+    <w:p>
+      <w:r>
+        <w:t>{</w:t>
+      </w:r>
+    </w:p>
+    <w:p>
+      <w:r>
+        <w:t xml:space="preserve">   Write-Warning "L'identifiant $</w:t>
+      </w:r>
+      <w:proofErr w:type="spellStart"/>
+      <w:r>
+        <w:t>Utilisateur</w:t>
+      </w:r>
+      <w:r>
+        <w:t>Fonction</w:t>
+      </w:r>
+      <w:proofErr w:type="spellEnd"/>
+      <w:r>
+        <w:t xml:space="preserve"> existe déjà dans l'AD"</w:t>
+      </w:r>
+    </w:p>
+    <w:p>
+      <w:r>
+        <w:t>}</w:t>
+      </w:r>
+    </w:p>
+    <w:p>
+      <w:proofErr w:type="spellStart"/>
+      <w:proofErr w:type="gramStart"/>
+      <w:r>
+        <w:t>else</w:t>
+      </w:r>
+      <w:proofErr w:type="spellEnd"/>
+      <w:proofErr w:type="gramEnd"/>
+    </w:p>
+    <w:p>
+      <w:r>
+        <w:t>{</w:t>
+      </w:r>
+    </w:p>
+    <w:p>
+      <w:r>
+        <w:t xml:space="preserve">      # New-</w:t>
+      </w:r>
+      <w:proofErr w:type="spellStart"/>
+      <w:r>
+        <w:t>ADUser</w:t>
+      </w:r>
+      <w:proofErr w:type="spellEnd"/>
+      <w:r>
+        <w:t>...</w:t>
+      </w:r>
+    </w:p>
+    <w:p>
+      <w:r>
+        <w:t>}</w:t>
+      </w:r>
+    </w:p>
+    <w:p>
+      <w:r>
+        <w:t>$</w:t>
+      </w:r>
+      <w:proofErr w:type="spellStart"/>
+      <w:r>
+        <w:t>CSVFile</w:t>
+      </w:r>
+      <w:proofErr w:type="spellEnd"/>
+      <w:r>
+        <w:t xml:space="preserve"> = "C:\Scripts\AD_USERS\Utilisateurs.csv"</w:t>
+      </w:r>
+    </w:p>
+    <w:p>
+      <w:r>
+        <w:t>$</w:t>
+      </w:r>
+      <w:proofErr w:type="spellStart"/>
+      <w:r>
+        <w:t>CSVData</w:t>
+      </w:r>
+      <w:proofErr w:type="spellEnd"/>
+      <w:r>
+        <w:t xml:space="preserve"> = Import-CSV -Path $</w:t>
+      </w:r>
+      <w:proofErr w:type="spellStart"/>
+      <w:r>
+        <w:t>CSVFile</w:t>
+      </w:r>
+      <w:proofErr w:type="spellEnd"/>
+      <w:r>
+        <w:t xml:space="preserve"> -</w:t>
+      </w:r>
+      <w:proofErr w:type="spellStart"/>
+      <w:r>
+        <w:t>Delimiter</w:t>
+      </w:r>
+      <w:proofErr w:type="spellEnd"/>
+      <w:r>
+        <w:t xml:space="preserve"> </w:t>
+      </w:r>
+      <w:proofErr w:type="gramStart"/>
+      <w:r>
+        <w:t>";</w:t>
+      </w:r>
+      <w:proofErr w:type="gramEnd"/>
+      <w:r>
+        <w:t>" -</w:t>
+      </w:r>
+      <w:proofErr w:type="spellStart"/>
+      <w:r>
+        <w:t>Encoding</w:t>
+      </w:r>
+      <w:proofErr w:type="spellEnd"/>
+      <w:r>
+        <w:t xml:space="preserve"> UTF8</w:t>
+      </w:r>
+    </w:p>
+    <w:p>
+      <w:proofErr w:type="spellStart"/>
+      <w:proofErr w:type="gramStart"/>
+      <w:r>
+        <w:lastRenderedPageBreak/>
+        <w:t>Foreach</w:t>
+      </w:r>
+      <w:proofErr w:type="spellEnd"/>
+      <w:r>
+        <w:t>(</w:t>
+      </w:r>
+      <w:proofErr w:type="gramEnd"/>
+      <w:r>
+        <w:t>$Utilisateur in $</w:t>
+      </w:r>
+      <w:proofErr w:type="spellStart"/>
+      <w:proofErr w:type="gramStart"/>
+      <w:r>
+        <w:t>CSVData</w:t>
+      </w:r>
+      <w:proofErr w:type="spellEnd"/>
+      <w:r>
+        <w:t>){</w:t>
+      </w:r>
+      <w:proofErr w:type="gramEnd"/>
+    </w:p>
+    <w:p/>
+    <w:p>
+      <w:r>
+        <w:t xml:space="preserve">   </w:t>
+      </w:r>
+      <w:r>
+        <w:t>$</w:t>
+      </w:r>
+      <w:proofErr w:type="spellStart"/>
+      <w:r>
+        <w:t>UtilisateurFonction</w:t>
+      </w:r>
+      <w:proofErr w:type="spellEnd"/>
+      <w:r>
+        <w:t xml:space="preserve"> = $</w:t>
+      </w:r>
+      <w:proofErr w:type="spellStart"/>
+      <w:r>
+        <w:t>Utilisateur.Fonction</w:t>
+      </w:r>
+      <w:proofErr w:type="spellEnd"/>
+    </w:p>
+    <w:p>
+      <w:r>
+        <w:t>   $</w:t>
+      </w:r>
+      <w:proofErr w:type="spellStart"/>
+      <w:r>
+        <w:t>UtilisateurMotDePasse</w:t>
+      </w:r>
+      <w:proofErr w:type="spellEnd"/>
+      <w:r>
+        <w:t xml:space="preserve"> = </w:t>
+      </w:r>
+      <w:r>
+        <w:t>$</w:t>
+      </w:r>
+      <w:proofErr w:type="spellStart"/>
+      <w:r>
+        <w:t>UtilisateurMotDePasse</w:t>
+      </w:r>
+      <w:proofErr w:type="spellEnd"/>
+    </w:p>
+    <w:p/>
+    <w:p>
+      <w:r>
+        <w:t>    # Vérifier la présence de l'utilisateur dans l'AD</w:t>
+      </w:r>
+    </w:p>
+    <w:p>
+      <w:r>
+        <w:t xml:space="preserve">    </w:t>
+      </w:r>
+      <w:proofErr w:type="gramStart"/>
+      <w:r>
+        <w:t>if</w:t>
+      </w:r>
+      <w:proofErr w:type="gramEnd"/>
+      <w:r>
+        <w:t xml:space="preserve"> (</w:t>
+      </w:r>
+      <w:proofErr w:type="spellStart"/>
+      <w:r>
+        <w:t>Get-ADUser</w:t>
+      </w:r>
+      <w:proofErr w:type="spellEnd"/>
+      <w:r>
+        <w:t xml:space="preserve"> -Filter {</w:t>
+      </w:r>
+      <w:proofErr w:type="spellStart"/>
+      <w:r>
+        <w:t>SamAccountName</w:t>
+      </w:r>
+      <w:proofErr w:type="spellEnd"/>
+      <w:r>
+        <w:t xml:space="preserve"> -eq $</w:t>
+      </w:r>
+      <w:proofErr w:type="spellStart"/>
+      <w:r>
+        <w:t>Utilisateur</w:t>
+      </w:r>
+      <w:r>
+        <w:t>Fonction</w:t>
+      </w:r>
+      <w:proofErr w:type="spellEnd"/>
+      <w:r>
+        <w:t>})</w:t>
+      </w:r>
+    </w:p>
+    <w:p>
+      <w:r>
+        <w:t xml:space="preserve">    {</w:t>
+      </w:r>
+    </w:p>
+    <w:p>
+      <w:r>
+        <w:t xml:space="preserve">        Write-Warning "L'identifiant $</w:t>
+      </w:r>
+      <w:proofErr w:type="spellStart"/>
+      <w:r>
+        <w:t>Utilisateur</w:t>
+      </w:r>
+      <w:r>
+        <w:t>Fonction</w:t>
+      </w:r>
+      <w:proofErr w:type="spellEnd"/>
+      <w:r>
+        <w:t xml:space="preserve"> existe déjà dans l'AD"</w:t>
+      </w:r>
+    </w:p>
+    <w:p>
+      <w:r>
+        <w:t xml:space="preserve">    }</w:t>
+      </w:r>
+    </w:p>
+    <w:p>
+      <w:r>
+        <w:t xml:space="preserve">    </w:t>
+      </w:r>
+      <w:proofErr w:type="spellStart"/>
+      <w:proofErr w:type="gramStart"/>
+      <w:r>
+        <w:t>else</w:t>
+      </w:r>
+      <w:proofErr w:type="spellEnd"/>
+      <w:proofErr w:type="gramEnd"/>
+    </w:p>
+    <w:p>
+      <w:r>
+        <w:t xml:space="preserve">    {</w:t>
+      </w:r>
+    </w:p>
+    <w:p>
+      <w:r>
+        <w:t xml:space="preserve">        New-</w:t>
+      </w:r>
+      <w:proofErr w:type="spellStart"/>
+      <w:r>
+        <w:t>ADUser</w:t>
+      </w:r>
+      <w:proofErr w:type="spellEnd"/>
+      <w:r>
+        <w:t xml:space="preserve"> -</w:t>
+      </w:r>
+      <w:r>
+        <w:t>Fonction</w:t>
+      </w:r>
+      <w:r>
+        <w:t xml:space="preserve"> "$</w:t>
+      </w:r>
+      <w:proofErr w:type="spellStart"/>
+      <w:r>
+        <w:t>Utilisateur</w:t>
+      </w:r>
+      <w:r>
+        <w:t>Fonction</w:t>
+      </w:r>
+      <w:proofErr w:type="spellEnd"/>
+      <w:r>
+        <w:t xml:space="preserve"> $</w:t>
+      </w:r>
+      <w:proofErr w:type="spellStart"/>
+      <w:r>
+        <w:t>Utilisateur</w:t>
+      </w:r>
+      <w:r>
+        <w:t>Fonction</w:t>
+      </w:r>
+      <w:proofErr w:type="spellEnd"/>
+      <w:r>
+        <w:t>" `</w:t>
+      </w:r>
+    </w:p>
+    <w:p>
+      <w:r>
+        <w:t xml:space="preserve">                    -</w:t>
+      </w:r>
+      <w:proofErr w:type="spellStart"/>
+      <w:r>
+        <w:t>Display</w:t>
+      </w:r>
+      <w:r>
+        <w:t>Fonction</w:t>
+      </w:r>
+      <w:proofErr w:type="spellEnd"/>
+      <w:r>
+        <w:t xml:space="preserve"> "$</w:t>
+      </w:r>
+      <w:proofErr w:type="spellStart"/>
+      <w:r>
+        <w:t>Utilisateu</w:t>
+      </w:r>
+      <w:r>
+        <w:t>rFonction</w:t>
+      </w:r>
+      <w:proofErr w:type="spellEnd"/>
+      <w:r>
+        <w:t xml:space="preserve"> $</w:t>
+      </w:r>
+      <w:proofErr w:type="spellStart"/>
+      <w:r>
+        <w:t>Utilisateur</w:t>
+      </w:r>
+      <w:r>
+        <w:t>Numero</w:t>
+      </w:r>
+      <w:proofErr w:type="spellEnd"/>
+      <w:r>
+        <w:t>" `</w:t>
+      </w:r>
+    </w:p>
+    <w:p>
+      <w:r>
+        <w:t xml:space="preserve">                    -</w:t>
+      </w:r>
+      <w:proofErr w:type="spellStart"/>
+      <w:r>
+        <w:t>GivenName</w:t>
+      </w:r>
+      <w:proofErr w:type="spellEnd"/>
+      <w:r>
+        <w:t xml:space="preserve"> $</w:t>
+      </w:r>
+      <w:proofErr w:type="spellStart"/>
+      <w:r>
+        <w:t>UtilisateurPrenom</w:t>
+      </w:r>
+      <w:proofErr w:type="spellEnd"/>
+      <w:r>
+        <w:t xml:space="preserve"> `</w:t>
+      </w:r>
+    </w:p>
+    <w:p>
+      <w:r>
+        <w:t xml:space="preserve">                    -</w:t>
+      </w:r>
+      <w:proofErr w:type="spellStart"/>
+      <w:r>
+        <w:t>Surname</w:t>
+      </w:r>
+      <w:proofErr w:type="spellEnd"/>
+      <w:r>
+        <w:t xml:space="preserve"> $</w:t>
+      </w:r>
+      <w:proofErr w:type="spellStart"/>
+      <w:r>
+        <w:t>UtilisateurNom</w:t>
+      </w:r>
+      <w:proofErr w:type="spellEnd"/>
+      <w:r>
+        <w:t xml:space="preserve"> `</w:t>
+      </w:r>
+    </w:p>
+    <w:p>
+      <w:r>
+        <w:t xml:space="preserve">                    -</w:t>
+      </w:r>
+      <w:proofErr w:type="spellStart"/>
+      <w:r>
+        <w:t>SamAccountName</w:t>
+      </w:r>
+      <w:proofErr w:type="spellEnd"/>
+      <w:r>
+        <w:t xml:space="preserve"> $</w:t>
+      </w:r>
+      <w:proofErr w:type="spellStart"/>
+      <w:r>
+        <w:t>UtilisateurLogin</w:t>
+      </w:r>
+      <w:proofErr w:type="spellEnd"/>
+      <w:r>
+        <w:t xml:space="preserve"> `</w:t>
+      </w:r>
+    </w:p>
+    <w:p>
+      <w:r>
+        <w:t xml:space="preserve">                    -</w:t>
+      </w:r>
+      <w:proofErr w:type="spellStart"/>
+      <w:r>
+        <w:t>UserPrincipalName</w:t>
+      </w:r>
+      <w:proofErr w:type="spellEnd"/>
+      <w:r>
+        <w:t xml:space="preserve"> "$</w:t>
+      </w:r>
+      <w:proofErr w:type="spellStart"/>
+      <w:r>
+        <w:t>UtilisateurLogin@it-connect.local</w:t>
+      </w:r>
+      <w:proofErr w:type="spellEnd"/>
+      <w:r>
+        <w:t>" `</w:t>
+      </w:r>
+    </w:p>
+    <w:p>
+      <w:r>
+        <w:t xml:space="preserve">                    -</w:t>
+      </w:r>
+      <w:proofErr w:type="spellStart"/>
+      <w:r>
+        <w:t>EmailAddress</w:t>
+      </w:r>
+      <w:proofErr w:type="spellEnd"/>
+      <w:r>
+        <w:t xml:space="preserve"> $</w:t>
+      </w:r>
+      <w:proofErr w:type="spellStart"/>
+      <w:r>
+        <w:t>UtilisateurEmail</w:t>
+      </w:r>
+      <w:proofErr w:type="spellEnd"/>
+      <w:r>
+        <w:t xml:space="preserve"> `</w:t>
+      </w:r>
+    </w:p>
+    <w:p>
+      <w:r>
+        <w:t xml:space="preserve">                    -Title $</w:t>
+      </w:r>
+      <w:proofErr w:type="spellStart"/>
+      <w:r>
+        <w:t>UtilisateurFonction</w:t>
+      </w:r>
+      <w:proofErr w:type="spellEnd"/>
+      <w:r>
+        <w:t xml:space="preserve"> `</w:t>
+      </w:r>
+    </w:p>
+    <w:p>
+      <w:r>
+        <w:t xml:space="preserve">                    -Path "OU=</w:t>
+      </w:r>
+      <w:proofErr w:type="spellStart"/>
+      <w:proofErr w:type="gramStart"/>
+      <w:r>
+        <w:t>Personnel,DC</w:t>
+      </w:r>
+      <w:proofErr w:type="spellEnd"/>
+      <w:proofErr w:type="gramEnd"/>
+      <w:r>
+        <w:t>=IT-</w:t>
+      </w:r>
+      <w:proofErr w:type="gramStart"/>
+      <w:r>
+        <w:t>CONNECT,DC</w:t>
+      </w:r>
+      <w:proofErr w:type="gramEnd"/>
+      <w:r>
+        <w:t>=LOCAL" `</w:t>
+      </w:r>
+    </w:p>
+    <w:p>
+      <w:r>
+        <w:t xml:space="preserve">                    -</w:t>
+      </w:r>
+      <w:proofErr w:type="spellStart"/>
+      <w:proofErr w:type="gramStart"/>
+      <w:r>
+        <w:t>AccountPassword</w:t>
+      </w:r>
+      <w:proofErr w:type="spellEnd"/>
+      <w:r>
+        <w:t>(</w:t>
+      </w:r>
+      <w:proofErr w:type="spellStart"/>
+      <w:proofErr w:type="gramEnd"/>
+      <w:r>
+        <w:t>ConvertTo-SecureString</w:t>
+      </w:r>
+      <w:proofErr w:type="spellEnd"/>
+      <w:r>
+        <w:t xml:space="preserve"> $</w:t>
+      </w:r>
+      <w:proofErr w:type="spellStart"/>
+      <w:r>
+        <w:t>UtilisateurMotDePasse</w:t>
+      </w:r>
+      <w:proofErr w:type="spellEnd"/>
+      <w:r>
+        <w:t xml:space="preserve"> -</w:t>
+      </w:r>
+      <w:proofErr w:type="spellStart"/>
+      <w:r>
+        <w:t>AsPlainText</w:t>
+      </w:r>
+      <w:proofErr w:type="spellEnd"/>
+      <w:r>
+        <w:t xml:space="preserve"> -Force) `</w:t>
+      </w:r>
+    </w:p>
+    <w:p>
+      <w:r>
+        <w:t xml:space="preserve">                    -</w:t>
+      </w:r>
+      <w:proofErr w:type="spellStart"/>
+      <w:r>
+        <w:t>ChangePasswordAtLogon</w:t>
+      </w:r>
+      <w:proofErr w:type="spellEnd"/>
+      <w:r>
+        <w:t xml:space="preserve"> $</w:t>
+      </w:r>
+      <w:proofErr w:type="spellStart"/>
+      <w:r>
+        <w:t>true</w:t>
+      </w:r>
+      <w:proofErr w:type="spellEnd"/>
+      <w:r>
+        <w:t xml:space="preserve"> `</w:t>
+      </w:r>
+    </w:p>
+    <w:p>
+      <w:r>
+        <w:t xml:space="preserve">                    -</w:t>
+      </w:r>
+      <w:proofErr w:type="spellStart"/>
+      <w:r>
+        <w:t>Enabled</w:t>
+      </w:r>
+      <w:proofErr w:type="spellEnd"/>
+      <w:r>
+        <w:t xml:space="preserve"> $</w:t>
+      </w:r>
+      <w:proofErr w:type="spellStart"/>
+      <w:r>
+        <w:t>true</w:t>
+      </w:r>
+      <w:proofErr w:type="spellEnd"/>
+    </w:p>
+    <w:p/>
+    <w:p>
+      <w:r>
+        <w:t>        Write-Output "Création de l'utilisateur : $</w:t>
+      </w:r>
+      <w:proofErr w:type="spellStart"/>
+      <w:r>
+        <w:t>UtilisateurLogin</w:t>
+      </w:r>
+      <w:proofErr w:type="spellEnd"/>
+      <w:r>
+        <w:t xml:space="preserve"> ($</w:t>
+      </w:r>
+      <w:proofErr w:type="spellStart"/>
+      <w:r>
+        <w:t>UtilisateurNom</w:t>
+      </w:r>
+      <w:proofErr w:type="spellEnd"/>
+      <w:r>
+        <w:t xml:space="preserve"> $</w:t>
+      </w:r>
+      <w:proofErr w:type="spellStart"/>
+      <w:r>
+        <w:t>UtilisateurPrenom</w:t>
+      </w:r>
+      <w:proofErr w:type="spellEnd"/>
+      <w:r>
+        <w:t>)"</w:t>
+      </w:r>
+    </w:p>
+    <w:p>
+      <w:r>
+        <w:t xml:space="preserve">    }</w:t>
+      </w:r>
+    </w:p>
+    <w:p>
+      <w:r>
+        <w:lastRenderedPageBreak/>
+        <w:t>}</w:t>
+      </w:r>
+    </w:p>
+    <w:p/>
+    <w:p>
+      <w:r>
+        <w:t>https://www.it-connect.fr/gerer-les-utilisateurs-et-ordinateurs-inactifs-dans-lactive-directory/</w:t>
+      </w:r>
+    </w:p>
+    <w:p/>
+    <w:p>
+      <w:r>
+        <w:t>Création des différents profils du BTS SIO IRIS dans chaque OU dédiée : SISR, SLAM</w:t>
+      </w:r>
+      <w:r>
+        <w:t>, Enseignants</w:t>
+      </w:r>
+    </w:p>
     <w:sectPr>
       <w:pgSz w:w="11906" w:h="16838"/>
       <w:pgMar w:top="1417" w:right="1417" w:bottom="1417" w:left="1417" w:header="708" w:footer="708" w:gutter="0"/>
@@ -1029,6 +2201,29 @@
       <w:spacing w:val="5"/>
     </w:rPr>
   </w:style>
+  <w:style w:type="character" w:styleId="Lienhypertexte">
+    <w:name w:val="Hyperlink"/>
+    <w:basedOn w:val="Policepardfaut"/>
+    <w:uiPriority w:val="99"/>
+    <w:unhideWhenUsed/>
+    <w:rsid w:val="00DB2F8E"/>
+    <w:rPr>
+      <w:color w:val="467886" w:themeColor="hyperlink"/>
+      <w:u w:val="single"/>
+    </w:rPr>
+  </w:style>
+  <w:style w:type="character" w:styleId="Mentionnonrsolue">
+    <w:name w:val="Unresolved Mention"/>
+    <w:basedOn w:val="Policepardfaut"/>
+    <w:uiPriority w:val="99"/>
+    <w:semiHidden/>
+    <w:unhideWhenUsed/>
+    <w:rsid w:val="00DB2F8E"/>
+    <w:rPr>
+      <w:color w:val="605E5C"/>
+      <w:shd w:val="clear" w:color="auto" w:fill="E1DFDD"/>
+    </w:rPr>
+  </w:style>
 </w:styles>
 </file>
 

</xml_diff>